<commit_message>
modifikasi sedikit lagi laporan teknis
</commit_message>
<xml_diff>
--- a/04_Reports_&_Paper/Final_Technical_Report/Final_Technical_Report_Kelompok6_Kompilasi_FINAL.docx
+++ b/04_Reports_&_Paper/Final_Technical_Report/Final_Technical_Report_Kelompok6_Kompilasi_FINAL.docx
@@ -281,7 +281,15 @@
                 <w:sz w:val="20"/>
                 <w:szCs w:val="20"/>
               </w:rPr>
-              <w:t>G640123107</w:t>
+              <w:t>G64012310</w:t>
+            </w:r>
+            <w:r>
+              <w:rPr>
+                <w:color w:val="000000" w:themeColor="text1"/>
+                <w:sz w:val="20"/>
+                <w:szCs w:val="20"/>
+              </w:rPr>
+              <w:t>1</w:t>
             </w:r>
             <w:r>
               <w:rPr>
@@ -406,7 +414,23 @@
                 <w:sz w:val="20"/>
                 <w:szCs w:val="20"/>
               </w:rPr>
-              <w:t>G6401231019</w:t>
+              <w:t>G64012310</w:t>
+            </w:r>
+            <w:r>
+              <w:rPr>
+                <w:color w:val="000000" w:themeColor="text1"/>
+                <w:sz w:val="20"/>
+                <w:szCs w:val="20"/>
+              </w:rPr>
+              <w:t>7</w:t>
+            </w:r>
+            <w:r>
+              <w:rPr>
+                <w:color w:val="000000" w:themeColor="text1"/>
+                <w:sz w:val="20"/>
+                <w:szCs w:val="20"/>
+              </w:rPr>
+              <w:t>9</w:t>
             </w:r>
           </w:p>
         </w:tc>

</xml_diff>